<commit_message>
Retira o recorte do público casual do projeto e recontextualiza o problema
A maioria das luderias já atende o público casual, então a questão passa
a ser a viabilidade de uma luderia em Salvador, sem segmentação de público.
O primeiro parágrafo do problema passa a situar a luderia na tendência de
consumo de experiências e no avanço do lazer nos shopping centers
(Gilovich, Kumar e Jampol, 2015; Eventbrite, 2014; Abrasce via
Mercado&Consumo, 2025). Sai o objetivo de caracterizar o comportamento de
consumo; os objetivos e os quadros 04 e 05 são renumerados.

Co-Authored-By: Claude Opus 5.5 <noreply@anthropic.com>
</commit_message>
<xml_diff>
--- a/textos/projeto_pesquisa_luderia.docx
+++ b/textos/projeto_pesquisa_luderia.docx
@@ -16,7 +16,7 @@
           <w:sz w:val="24"/>
           <w:szCs w:val="24"/>
         </w:rPr>
-        <w:t xml:space="preserve">PROJETO DE TCC - PLANO DE NEGÓCIOS DE UMA LUDERIA PARA O PÚBLICO CASUAL</w:t>
+        <w:t xml:space="preserve">PROJETO DE TCC - PLANO DE NEGÓCIOS DE UMA LUDERIA EM SALVADOR</w:t>
       </w:r>
     </w:p>
     <w:p>
@@ -65,7 +65,25 @@
           <w:sz w:val="24"/>
           <w:szCs w:val="24"/>
         </w:rPr>
-        <w:t xml:space="preserve">O mercado brasileiro de jogos de tabuleiro está em expansão: os jogos de tabuleiro e cartas passaram de 9,1% para 13,1% das vendas da indústria de brinquedos entre 2017 e 2025 (ABRINQ, 2026). Esse crescimento sustenta um formato de negócio específico: a luderia, estabelecimento que combina alimentação, bebidas e acesso a um acervo de jogos.</w:t>
+        <w:t xml:space="preserve">O consumo de lazer está se deslocando da posse de bens para a vivência de experiências. A pesquisa em comportamento do consumidor mostra que compras de experiências geram mais satisfação que compras de bens materiais (GILOVICH; KUMAR; JAMPOL, 2015). Essa preferência é mais forte nas gerações mais novas: nos Estados Unidos, 78% dos </w:t>
+      </w:r>
+      <w:r>
+        <w:rPr>
+          <w:rFonts w:ascii="Arial" w:cs="Arial" w:eastAsia="Arial" w:hAnsi="Arial"/>
+          <w:i/>
+          <w:iCs/>
+          <w:sz w:val="24"/>
+          <w:szCs w:val="24"/>
+        </w:rPr>
+        <w:t xml:space="preserve">millennials</w:t>
+      </w:r>
+      <w:r>
+        <w:rPr>
+          <w:rFonts w:ascii="Arial" w:cs="Arial" w:eastAsia="Arial" w:hAnsi="Arial"/>
+          <w:sz w:val="24"/>
+          <w:szCs w:val="24"/>
+        </w:rPr>
+        <w:t xml:space="preserve"> declararam preferir gastar com uma experiência a comprar um bem desejado (EVENTBRITE, 2014). O varejo físico acompanha esse movimento. Nos shopping centers brasileiros, as operações de lazer passaram de 1,4% para 2,2% do total de lojas entre 2019 e 2023, segundo dados da Abrasce (MERCADO&amp;CONSUMO, 2025).</w:t>
       </w:r>
     </w:p>
     <w:p>
@@ -80,7 +98,7 @@
           <w:sz w:val="24"/>
           <w:szCs w:val="24"/>
         </w:rPr>
-        <w:t xml:space="preserve">As luderias brasileiras operam, porém, com uma oferta desenhada para o público hobbyista: acervos extensos, jogos de regras complexas e monitoria especializada. O público casual - o consumidor que vê o jogo como meio de socialização, e não como fim em si mesmo - permanece pouco atendido. No exterior, esse público sustenta o setor de </w:t>
+        <w:t xml:space="preserve">A luderia se insere nessa tendência. O formato combina alimentação, bebidas e acesso a um acervo de jogos de tabuleiro e cartas em uma mesma ocasião social. A demanda por jogos também cresce: os jogos de tabuleiro e cartas passaram de 9,1% para 13,1% das vendas da indústria de brinquedos entre 2017 e 2025 (ABRINQ, 2026). No exterior, o formato integra o setor de </w:t>
       </w:r>
       <w:r>
         <w:rPr>
@@ -145,7 +163,7 @@
           <w:sz w:val="24"/>
           <w:szCs w:val="24"/>
         </w:rPr>
-        <w:t xml:space="preserve">Uma luderia em Salvador posicionada para o público casual é viável, e sob quais condições de ponto, preço e ocupação?</w:t>
+        <w:t xml:space="preserve">Uma luderia em Salvador é viável, e sob quais condições de ponto, preço e ocupação?</w:t>
       </w:r>
     </w:p>
     <w:p>
@@ -177,7 +195,7 @@
           <w:sz w:val="24"/>
           <w:szCs w:val="24"/>
         </w:rPr>
-        <w:t xml:space="preserve">Avaliar a viabilidade mercadológica, operacional e econômico-financeira de uma luderia em Salvador posicionada para o público casual, a partir de premissas sustentadas por dados secundários públicos e por observação direta.</w:t>
+        <w:t xml:space="preserve">Avaliar a viabilidade mercadológica, operacional e econômico-financeira de uma luderia em Salvador, a partir de premissas sustentadas por dados secundários públicos e por observação direta.</w:t>
       </w:r>
     </w:p>
     <w:p>
@@ -214,25 +232,6 @@
           <w:szCs w:val="24"/>
         </w:rPr>
         <w:t xml:space="preserve">Analisar o mercado e a concorrência de luderias nas 14 metrópoles brasileiras, com destaque para Salvador, quanto a avaliação, preço e cardápio.</w:t>
-      </w:r>
-    </w:p>
-    <w:p>
-      <w:pPr>
-        <w:pStyle w:val="ListParagraph"/>
-        <w:numPr>
-          <w:ilvl w:val="0"/>
-          <w:numId w:val="2"/>
-        </w:numPr>
-        <w:spacing w:after="0" w:line="360"/>
-        <w:jc w:val="both"/>
-      </w:pPr>
-      <w:r>
-        <w:rPr>
-          <w:rFonts w:ascii="Arial" w:cs="Arial" w:eastAsia="Arial" w:hAnsi="Arial"/>
-          <w:sz w:val="24"/>
-          <w:szCs w:val="24"/>
-        </w:rPr>
-        <w:t xml:space="preserve">Caracterizar o comportamento de consumo do público das luderias.</w:t>
       </w:r>
     </w:p>
     <w:p>
@@ -10668,7 +10667,7 @@
                 <w:sz w:val="20"/>
                 <w:szCs w:val="20"/>
               </w:rPr>
-              <w:t xml:space="preserve">2. Caracterizar o comportamento de consumo</w:t>
+              <w:t xml:space="preserve">2. Definir posicionamento e composto de marketing</w:t>
             </w:r>
           </w:p>
         </w:tc>
@@ -10702,7 +10701,7 @@
                 <w:sz w:val="20"/>
                 <w:szCs w:val="20"/>
               </w:rPr>
-              <w:t xml:space="preserve">Público</w:t>
+              <w:t xml:space="preserve">Posicionamento; produto; preço</w:t>
             </w:r>
           </w:p>
         </w:tc>
@@ -10736,7 +10735,7 @@
                 <w:sz w:val="20"/>
                 <w:szCs w:val="20"/>
               </w:rPr>
-              <w:t xml:space="preserve">Atributos da experiência; pessoas por mesa; gasto por pessoa; poder de compra</w:t>
+              <w:t xml:space="preserve">Atributos da experiência; satisfação por atributo; preço; variedade; acervo</w:t>
             </w:r>
           </w:p>
         </w:tc>
@@ -10770,7 +10769,7 @@
                 <w:sz w:val="20"/>
                 <w:szCs w:val="20"/>
               </w:rPr>
-              <w:t xml:space="preserve">B02-B05, D03, E02, E03</w:t>
+              <w:t xml:space="preserve">A03, A06-A09, B01-B03, B06, F01-F02</w:t>
             </w:r>
           </w:p>
         </w:tc>
@@ -10810,7 +10809,7 @@
                 <w:sz w:val="20"/>
                 <w:szCs w:val="20"/>
               </w:rPr>
-              <w:t xml:space="preserve">3. Definir posicionamento e composto de marketing</w:t>
+              <w:t xml:space="preserve">3. Estimar demanda, ocupação e giro</w:t>
             </w:r>
           </w:p>
         </w:tc>
@@ -10844,7 +10843,7 @@
                 <w:sz w:val="20"/>
                 <w:szCs w:val="20"/>
               </w:rPr>
-              <w:t xml:space="preserve">Posicionamento; produto; preço</w:t>
+              <w:t xml:space="preserve">Demanda</w:t>
             </w:r>
           </w:p>
         </w:tc>
@@ -10878,7 +10877,7 @@
                 <w:sz w:val="20"/>
                 <w:szCs w:val="20"/>
               </w:rPr>
-              <w:t xml:space="preserve">Atributos da experiência; satisfação por atributo; preço; variedade; acervo</w:t>
+              <w:t xml:space="preserve">Taxa de ocupação; transações; permanência; pessoas por mesa; velocidade de avaliações; tamanho do mercado</w:t>
             </w:r>
           </w:p>
         </w:tc>
@@ -10912,7 +10911,7 @@
                 <w:sz w:val="20"/>
                 <w:szCs w:val="20"/>
               </w:rPr>
-              <w:t xml:space="preserve">A03, A06-A09, B01-B03, B06, F01-F02</w:t>
+              <w:t xml:space="preserve">B04, B07, D01-D06, E01</w:t>
             </w:r>
           </w:p>
         </w:tc>
@@ -10952,7 +10951,7 @@
                 <w:sz w:val="20"/>
                 <w:szCs w:val="20"/>
               </w:rPr>
-              <w:t xml:space="preserve">4. Estimar demanda, ocupação e giro</w:t>
+              <w:t xml:space="preserve">4. Dimensionar operação e requisitos jurídicos</w:t>
             </w:r>
           </w:p>
         </w:tc>
@@ -10986,7 +10985,7 @@
                 <w:sz w:val="20"/>
                 <w:szCs w:val="20"/>
               </w:rPr>
-              <w:t xml:space="preserve">Demanda</w:t>
+              <w:t xml:space="preserve">Operação; aspectos legais</w:t>
             </w:r>
           </w:p>
         </w:tc>
@@ -11020,7 +11019,7 @@
                 <w:sz w:val="20"/>
                 <w:szCs w:val="20"/>
               </w:rPr>
-              <w:t xml:space="preserve">Taxa de ocupação; transações; permanência; pessoas por mesa; velocidade de avaliações; tamanho do mercado</w:t>
+              <w:t xml:space="preserve">Reclamações operacionais; capacidade; custo de pessoal; tributos</w:t>
             </w:r>
           </w:p>
         </w:tc>
@@ -11054,7 +11053,7 @@
                 <w:sz w:val="20"/>
                 <w:szCs w:val="20"/>
               </w:rPr>
-              <w:t xml:space="preserve">B04, B07, D01-D06, E01</w:t>
+              <w:t xml:space="preserve">B02-B03, D01, D03-D04, E05, E07</w:t>
             </w:r>
           </w:p>
         </w:tc>
@@ -11094,7 +11093,7 @@
                 <w:sz w:val="20"/>
                 <w:szCs w:val="20"/>
               </w:rPr>
-              <w:t xml:space="preserve">5. Dimensionar operação e requisitos jurídicos</w:t>
+              <w:t xml:space="preserve">5. Projetar investimentos, receitas, custos e indicadores</w:t>
             </w:r>
           </w:p>
         </w:tc>
@@ -11128,7 +11127,7 @@
                 <w:sz w:val="20"/>
                 <w:szCs w:val="20"/>
               </w:rPr>
-              <w:t xml:space="preserve">Operação; aspectos legais</w:t>
+              <w:t xml:space="preserve">Viabilidade econômico-financeira</w:t>
             </w:r>
           </w:p>
         </w:tc>
@@ -11162,7 +11161,7 @@
                 <w:sz w:val="20"/>
                 <w:szCs w:val="20"/>
               </w:rPr>
-              <w:t xml:space="preserve">Reclamações operacionais; capacidade; custo de pessoal; tributos</w:t>
+              <w:t xml:space="preserve">Ticket; preço efetivo; custos; benchmark setorial; taxa de desconto</w:t>
             </w:r>
           </w:p>
         </w:tc>
@@ -11196,7 +11195,7 @@
                 <w:sz w:val="20"/>
                 <w:szCs w:val="20"/>
               </w:rPr>
-              <w:t xml:space="preserve">B02-B03, D01, D03-D04, E05, E07</w:t>
+              <w:t xml:space="preserve">A07-A08, B05, D07, E03-E08</w:t>
             </w:r>
           </w:p>
         </w:tc>
@@ -11236,7 +11235,7 @@
                 <w:sz w:val="20"/>
                 <w:szCs w:val="20"/>
               </w:rPr>
-              <w:t xml:space="preserve">6. Projetar investimentos, receitas, custos e indicadores</w:t>
+              <w:t xml:space="preserve">6. Identificar premissas críticas e pontos de ruptura</w:t>
             </w:r>
           </w:p>
         </w:tc>
@@ -11270,7 +11269,7 @@
                 <w:sz w:val="20"/>
                 <w:szCs w:val="20"/>
               </w:rPr>
-              <w:t xml:space="preserve">Viabilidade econômico-financeira</w:t>
+              <w:t xml:space="preserve">Risco das premissas</w:t>
             </w:r>
           </w:p>
         </w:tc>
@@ -11304,7 +11303,7 @@
                 <w:sz w:val="20"/>
                 <w:szCs w:val="20"/>
               </w:rPr>
-              <w:t xml:space="preserve">Ticket; preço efetivo; custos; benchmark setorial; taxa de desconto</w:t>
+              <w:t xml:space="preserve">Premissas do modelo financeiro com faixas e nível de evidência</w:t>
             </w:r>
           </w:p>
         </w:tc>
@@ -11338,7 +11337,7 @@
                 <w:sz w:val="20"/>
                 <w:szCs w:val="20"/>
               </w:rPr>
-              <w:t xml:space="preserve">A07-A08, B05, D07, E03-E08</w:t>
+              <w:t xml:space="preserve">Todos os itens que alimentam premissas</w:t>
             </w:r>
           </w:p>
         </w:tc>
@@ -11378,7 +11377,7 @@
                 <w:sz w:val="20"/>
                 <w:szCs w:val="20"/>
               </w:rPr>
-              <w:t xml:space="preserve">7. Identificar premissas críticas e pontos de ruptura</w:t>
+              <w:t xml:space="preserve">7. Propor contingência e validações</w:t>
             </w:r>
           </w:p>
         </w:tc>
@@ -11412,7 +11411,7 @@
                 <w:sz w:val="20"/>
                 <w:szCs w:val="20"/>
               </w:rPr>
-              <w:t xml:space="preserve">Risco das premissas</w:t>
+              <w:t xml:space="preserve">Risco do negócio</w:t>
             </w:r>
           </w:p>
         </w:tc>
@@ -11446,7 +11445,7 @@
                 <w:sz w:val="20"/>
                 <w:szCs w:val="20"/>
               </w:rPr>
-              <w:t xml:space="preserve">Premissas do modelo financeiro com faixas e nível de evidência</w:t>
+              <w:t xml:space="preserve">Premissas críticas; limitações da evidência</w:t>
             </w:r>
           </w:p>
         </w:tc>
@@ -11480,149 +11479,7 @@
                 <w:sz w:val="20"/>
                 <w:szCs w:val="20"/>
               </w:rPr>
-              <w:t xml:space="preserve">Todos os itens que alimentam premissas</w:t>
-            </w:r>
-          </w:p>
-        </w:tc>
-      </w:tr>
-      <w:tr>
-        <w:trPr>
-          <w:cantSplit/>
-          <w:tblHeader w:val="false"/>
-        </w:trPr>
-        <w:tc>
-          <w:tcPr>
-            <w:tcW w:type="dxa" w:w="2358"/>
-            <w:tcBorders>
-              <w:top w:val="single" w:color="000000" w:sz="6"/>
-              <w:left w:val="single" w:color="000000" w:sz="6"/>
-              <w:bottom w:val="single" w:color="000000" w:sz="6"/>
-              <w:right w:val="single" w:color="000000" w:sz="6"/>
-            </w:tcBorders>
-            <w:shd w:fill="FFFFFF" w:color="auto" w:val="clear"/>
-            <w:tcMar>
-              <w:top w:type="dxa" w:w="40"/>
-              <w:left w:type="dxa" w:w="80"/>
-              <w:bottom w:type="dxa" w:w="40"/>
-              <w:right w:type="dxa" w:w="80"/>
-            </w:tcMar>
-          </w:tcPr>
-          <w:p>
-            <w:pPr>
-              <w:spacing w:after="0" w:line="240"/>
-              <w:jc w:val="left"/>
-            </w:pPr>
-            <w:r>
-              <w:rPr>
-                <w:rFonts w:ascii="Arial" w:cs="Arial" w:eastAsia="Arial" w:hAnsi="Arial"/>
-                <w:b w:val="false"/>
-                <w:bCs w:val="false"/>
-                <w:sz w:val="20"/>
-                <w:szCs w:val="20"/>
-              </w:rPr>
-              <w:t xml:space="preserve">8. Propor contingência e validações</w:t>
-            </w:r>
-          </w:p>
-        </w:tc>
-        <w:tc>
-          <w:tcPr>
-            <w:tcW w:type="dxa" w:w="1632"/>
-            <w:tcBorders>
-              <w:top w:val="single" w:color="000000" w:sz="6"/>
-              <w:left w:val="single" w:color="000000" w:sz="6"/>
-              <w:bottom w:val="single" w:color="000000" w:sz="6"/>
-              <w:right w:val="single" w:color="000000" w:sz="6"/>
-            </w:tcBorders>
-            <w:shd w:fill="FFFFFF" w:color="auto" w:val="clear"/>
-            <w:tcMar>
-              <w:top w:type="dxa" w:w="40"/>
-              <w:left w:type="dxa" w:w="80"/>
-              <w:bottom w:type="dxa" w:w="40"/>
-              <w:right w:type="dxa" w:w="80"/>
-            </w:tcMar>
-          </w:tcPr>
-          <w:p>
-            <w:pPr>
-              <w:spacing w:after="0" w:line="240"/>
-              <w:jc w:val="left"/>
-            </w:pPr>
-            <w:r>
-              <w:rPr>
-                <w:rFonts w:ascii="Arial" w:cs="Arial" w:eastAsia="Arial" w:hAnsi="Arial"/>
-                <w:b w:val="false"/>
-                <w:bCs w:val="false"/>
-                <w:sz w:val="20"/>
-                <w:szCs w:val="20"/>
-              </w:rPr>
-              <w:t xml:space="preserve">Risco do negócio</w:t>
-            </w:r>
-          </w:p>
-        </w:tc>
-        <w:tc>
-          <w:tcPr>
-            <w:tcW w:type="dxa" w:w="3265"/>
-            <w:tcBorders>
-              <w:top w:val="single" w:color="000000" w:sz="6"/>
-              <w:left w:val="single" w:color="000000" w:sz="6"/>
-              <w:bottom w:val="single" w:color="000000" w:sz="6"/>
-              <w:right w:val="single" w:color="000000" w:sz="6"/>
-            </w:tcBorders>
-            <w:shd w:fill="FFFFFF" w:color="auto" w:val="clear"/>
-            <w:tcMar>
-              <w:top w:type="dxa" w:w="40"/>
-              <w:left w:type="dxa" w:w="80"/>
-              <w:bottom w:type="dxa" w:w="40"/>
-              <w:right w:type="dxa" w:w="80"/>
-            </w:tcMar>
-          </w:tcPr>
-          <w:p>
-            <w:pPr>
-              <w:spacing w:after="0" w:line="240"/>
-              <w:jc w:val="left"/>
-            </w:pPr>
-            <w:r>
-              <w:rPr>
-                <w:rFonts w:ascii="Arial" w:cs="Arial" w:eastAsia="Arial" w:hAnsi="Arial"/>
-                <w:b w:val="false"/>
-                <w:bCs w:val="false"/>
-                <w:sz w:val="20"/>
-                <w:szCs w:val="20"/>
-              </w:rPr>
-              <w:t xml:space="preserve">Premissas críticas; limitações da evidência</w:t>
-            </w:r>
-          </w:p>
-        </w:tc>
-        <w:tc>
-          <w:tcPr>
-            <w:tcW w:type="dxa" w:w="1816"/>
-            <w:tcBorders>
-              <w:top w:val="single" w:color="000000" w:sz="6"/>
-              <w:left w:val="single" w:color="000000" w:sz="6"/>
-              <w:bottom w:val="single" w:color="000000" w:sz="6"/>
-              <w:right w:val="single" w:color="000000" w:sz="6"/>
-            </w:tcBorders>
-            <w:shd w:fill="FFFFFF" w:color="auto" w:val="clear"/>
-            <w:tcMar>
-              <w:top w:type="dxa" w:w="40"/>
-              <w:left w:type="dxa" w:w="80"/>
-              <w:bottom w:type="dxa" w:w="40"/>
-              <w:right w:type="dxa" w:w="80"/>
-            </w:tcMar>
-          </w:tcPr>
-          <w:p>
-            <w:pPr>
-              <w:spacing w:after="0" w:line="240"/>
-              <w:jc w:val="left"/>
-            </w:pPr>
-            <w:r>
-              <w:rPr>
-                <w:rFonts w:ascii="Arial" w:cs="Arial" w:eastAsia="Arial" w:hAnsi="Arial"/>
-                <w:b w:val="false"/>
-                <w:bCs w:val="false"/>
-                <w:sz w:val="20"/>
-                <w:szCs w:val="20"/>
-              </w:rPr>
-              <w:t xml:space="preserve">Saídas do objetivo 7</w:t>
+              <w:t xml:space="preserve">Saídas do objetivo 6</w:t>
             </w:r>
           </w:p>
         </w:tc>
@@ -11918,7 +11775,7 @@
                 <w:sz w:val="20"/>
                 <w:szCs w:val="20"/>
               </w:rPr>
-              <w:t xml:space="preserve">Distribuição do tamanho dos grupos (citado e observado) e dos valores por pessoa citados; perfil demográfico e de renda de Salvador</w:t>
+              <w:t xml:space="preserve">Análise de conteúdo com dicionário validado (kappa e F1); análise de penalidade e recompensa; regressão da nota com efeito fixo por estabelecimento (H1); comparação da proporção de reclamações de preço entre políticas de cobrança (H3); grade ERRC</w:t>
             </w:r>
           </w:p>
         </w:tc>
@@ -11992,7 +11849,7 @@
                 <w:sz w:val="20"/>
                 <w:szCs w:val="20"/>
               </w:rPr>
-              <w:t xml:space="preserve">Análise de conteúdo com dicionário validado (kappa e F1); análise de penalidade e recompensa; regressão da nota com efeito fixo por estabelecimento (H1); comparação da proporção de reclamações de preço entre políticas de cobrança (H3); grade ERRC</w:t>
+              <w:t xml:space="preserve">Pessoas por hora e permanência; notas fiscais emitidas em 15 dias × pessoas por nota; modelo de calibração (visitantes estimados na São Jogue ÷ velocidade de avaliações → fluxo dos demais concorrentes); resultados em faixa</w:t>
             </w:r>
           </w:p>
         </w:tc>
@@ -12066,7 +11923,7 @@
                 <w:sz w:val="20"/>
                 <w:szCs w:val="20"/>
               </w:rPr>
-              <w:t xml:space="preserve">Pessoas por hora e permanência; notas fiscais emitidas em 15 dias × pessoas por nota; modelo de calibração (visitantes estimados na São Jogue ÷ velocidade de avaliações → fluxo dos demais concorrentes); resultados em faixa</w:t>
+              <w:t xml:space="preserve">Ranking de reclamações com intervalo de confiança; dimensionamento de mesas e equipe; levantamento documental da legislação</w:t>
             </w:r>
           </w:p>
         </w:tc>
@@ -12140,7 +11997,7 @@
                 <w:sz w:val="20"/>
                 <w:szCs w:val="20"/>
               </w:rPr>
-              <w:t xml:space="preserve">Ranking de reclamações com intervalo de confiança; dimensionamento de mesas e equipe; levantamento documental da legislação</w:t>
+              <w:t xml:space="preserve">Cesta de consumo por pessoa calibrada pelos valores citados (H5) e checada contra a POF; árvore de direcionadores; registro de premissas com faixas; DRE e fluxo de caixa projetados; VPL, TIR, payback descontado e ponto de equilíbrio</w:t>
             </w:r>
           </w:p>
         </w:tc>
@@ -12214,7 +12071,7 @@
                 <w:sz w:val="20"/>
                 <w:szCs w:val="20"/>
               </w:rPr>
-              <w:t xml:space="preserve">Cesta de consumo por pessoa calibrada pelos valores citados (H5) e checada contra a POF; árvore de direcionadores; registro de premissas com faixas; DRE e fluxo de caixa projetados; VPL, TIR, payback descontado e ponto de equilíbrio</w:t>
+              <w:t xml:space="preserve">Análise de sensibilidade (gráfico tornado); ponto de ruptura; simulação de Monte Carlo (opcional)</w:t>
             </w:r>
           </w:p>
         </w:tc>
@@ -12255,80 +12112,6 @@
                 <w:szCs w:val="20"/>
               </w:rPr>
               <w:t xml:space="preserve">7</w:t>
-            </w:r>
-          </w:p>
-        </w:tc>
-        <w:tc>
-          <w:tcPr>
-            <w:tcW w:type="dxa" w:w="6713"/>
-            <w:tcBorders>
-              <w:top w:val="single" w:color="000000" w:sz="6"/>
-              <w:left w:val="single" w:color="000000" w:sz="6"/>
-              <w:bottom w:val="single" w:color="000000" w:sz="6"/>
-              <w:right w:val="single" w:color="000000" w:sz="6"/>
-            </w:tcBorders>
-            <w:shd w:fill="FFFFFF" w:color="auto" w:val="clear"/>
-            <w:tcMar>
-              <w:top w:type="dxa" w:w="40"/>
-              <w:left w:type="dxa" w:w="80"/>
-              <w:bottom w:type="dxa" w:w="40"/>
-              <w:right w:type="dxa" w:w="80"/>
-            </w:tcMar>
-          </w:tcPr>
-          <w:p>
-            <w:pPr>
-              <w:spacing w:after="0" w:line="240"/>
-              <w:jc w:val="left"/>
-            </w:pPr>
-            <w:r>
-              <w:rPr>
-                <w:rFonts w:ascii="Arial" w:cs="Arial" w:eastAsia="Arial" w:hAnsi="Arial"/>
-                <w:b w:val="false"/>
-                <w:bCs w:val="false"/>
-                <w:sz w:val="20"/>
-                <w:szCs w:val="20"/>
-              </w:rPr>
-              <w:t xml:space="preserve">Análise de sensibilidade (gráfico tornado); ponto de ruptura; simulação de Monte Carlo (opcional)</w:t>
-            </w:r>
-          </w:p>
-        </w:tc>
-      </w:tr>
-      <w:tr>
-        <w:trPr>
-          <w:cantSplit/>
-          <w:tblHeader w:val="false"/>
-        </w:trPr>
-        <w:tc>
-          <w:tcPr>
-            <w:tcW w:type="dxa" w:w="2358"/>
-            <w:tcBorders>
-              <w:top w:val="single" w:color="000000" w:sz="6"/>
-              <w:left w:val="single" w:color="000000" w:sz="6"/>
-              <w:bottom w:val="single" w:color="000000" w:sz="6"/>
-              <w:right w:val="single" w:color="000000" w:sz="6"/>
-            </w:tcBorders>
-            <w:shd w:fill="FFFFFF" w:color="auto" w:val="clear"/>
-            <w:tcMar>
-              <w:top w:type="dxa" w:w="40"/>
-              <w:left w:type="dxa" w:w="80"/>
-              <w:bottom w:type="dxa" w:w="40"/>
-              <w:right w:type="dxa" w:w="80"/>
-            </w:tcMar>
-          </w:tcPr>
-          <w:p>
-            <w:pPr>
-              <w:spacing w:after="0" w:line="240"/>
-              <w:jc w:val="left"/>
-            </w:pPr>
-            <w:r>
-              <w:rPr>
-                <w:rFonts w:ascii="Arial" w:cs="Arial" w:eastAsia="Arial" w:hAnsi="Arial"/>
-                <w:b w:val="false"/>
-                <w:bCs w:val="false"/>
-                <w:sz w:val="20"/>
-                <w:szCs w:val="20"/>
-              </w:rPr>
-              <w:t xml:space="preserve">8</w:t>
             </w:r>
           </w:p>
         </w:tc>
@@ -12683,6 +12466,70 @@
           <w:sz w:val="24"/>
           <w:szCs w:val="24"/>
         </w:rPr>
+        <w:t xml:space="preserve">EVENTBRITE. </w:t>
+      </w:r>
+      <w:r>
+        <w:rPr>
+          <w:rFonts w:ascii="Arial" w:cs="Arial" w:eastAsia="Arial" w:hAnsi="Arial"/>
+          <w:i/>
+          <w:iCs/>
+          <w:sz w:val="24"/>
+          <w:szCs w:val="24"/>
+        </w:rPr>
+        <w:t xml:space="preserve">Millennials</w:t>
+      </w:r>
+      <w:r>
+        <w:rPr>
+          <w:rFonts w:ascii="Arial" w:cs="Arial" w:eastAsia="Arial" w:hAnsi="Arial"/>
+          <w:sz w:val="24"/>
+          <w:szCs w:val="24"/>
+        </w:rPr>
+        <w:t xml:space="preserve">: fueling the experience economy. Pesquisa conduzida pela Harris Poll, 2014. [A VERIFICAR: localizar o relatório original.]</w:t>
+      </w:r>
+    </w:p>
+    <w:p>
+      <w:pPr>
+        <w:spacing w:after="240" w:line="240"/>
+        <w:jc w:val="left"/>
+      </w:pPr>
+      <w:r>
+        <w:rPr>
+          <w:rFonts w:ascii="Arial" w:cs="Arial" w:eastAsia="Arial" w:hAnsi="Arial"/>
+          <w:sz w:val="24"/>
+          <w:szCs w:val="24"/>
+        </w:rPr>
+        <w:t xml:space="preserve">GILOVICH, Thomas; KUMAR, Amit; JAMPOL, Lily. A wonderful life: experiential consumption and the pursuit of happiness. </w:t>
+      </w:r>
+      <w:r>
+        <w:rPr>
+          <w:rFonts w:ascii="Arial" w:cs="Arial" w:eastAsia="Arial" w:hAnsi="Arial"/>
+          <w:i/>
+          <w:iCs/>
+          <w:sz w:val="24"/>
+          <w:szCs w:val="24"/>
+        </w:rPr>
+        <w:t xml:space="preserve">Journal of Consumer Psychology</w:t>
+      </w:r>
+      <w:r>
+        <w:rPr>
+          <w:rFonts w:ascii="Arial" w:cs="Arial" w:eastAsia="Arial" w:hAnsi="Arial"/>
+          <w:sz w:val="24"/>
+          <w:szCs w:val="24"/>
+        </w:rPr>
+        <w:t xml:space="preserve">, v. 25, n. 1, p. 152-165, 2015. DOI: 10.1016/j.jcps.2014.08.004.</w:t>
+      </w:r>
+    </w:p>
+    <w:p>
+      <w:pPr>
+        <w:spacing w:after="240" w:line="240"/>
+        <w:jc w:val="left"/>
+      </w:pPr>
+      <w:r>
+        <w:rPr>
+          <w:rFonts w:ascii="Arial" w:cs="Arial" w:eastAsia="Arial" w:hAnsi="Arial"/>
+          <w:sz w:val="24"/>
+          <w:szCs w:val="24"/>
+        </w:rPr>
         <w:t xml:space="preserve">KAM INSIGHT. </w:t>
       </w:r>
       <w:r>
@@ -12702,6 +12549,38 @@
           <w:szCs w:val="24"/>
         </w:rPr>
         <w:t xml:space="preserve">: winning a new customer occasion. KAM Media, 2022. Disponível em: https://kaminsight.com/wp-content/uploads/sites/2044/2023/07/KAM-Competitive-Socialising-Feb-22.pdf. [Completar data de acesso.]</w:t>
+      </w:r>
+    </w:p>
+    <w:p>
+      <w:pPr>
+        <w:spacing w:after="240" w:line="240"/>
+        <w:jc w:val="left"/>
+      </w:pPr>
+      <w:r>
+        <w:rPr>
+          <w:rFonts w:ascii="Arial" w:cs="Arial" w:eastAsia="Arial" w:hAnsi="Arial"/>
+          <w:sz w:val="24"/>
+          <w:szCs w:val="24"/>
+        </w:rPr>
+        <w:t xml:space="preserve">MERCADO&amp;CONSUMO. Lazer é a segunda maior motivação de ida a shopping centers. </w:t>
+      </w:r>
+      <w:r>
+        <w:rPr>
+          <w:rFonts w:ascii="Arial" w:cs="Arial" w:eastAsia="Arial" w:hAnsi="Arial"/>
+          <w:i/>
+          <w:iCs/>
+          <w:sz w:val="24"/>
+          <w:szCs w:val="24"/>
+        </w:rPr>
+        <w:t xml:space="preserve">Mercado&amp;Consumo</w:t>
+      </w:r>
+      <w:r>
+        <w:rPr>
+          <w:rFonts w:ascii="Arial" w:cs="Arial" w:eastAsia="Arial" w:hAnsi="Arial"/>
+          <w:sz w:val="24"/>
+          <w:szCs w:val="24"/>
+        </w:rPr>
+        <w:t xml:space="preserve">, 8 jan. 2025. Disponível em: https://mercadoeconsumo.com.br/08/01/2025/shopping-centers/lazer-e-a-segunda-maior-motivacao-de-ida-a-shopping-centers. Acesso em: 2 out. 2026. [Substituir pela publicação original da Abrasce, quando localizada.]</w:t>
       </w:r>
     </w:p>
     <w:p>

</xml_diff>